<commit_message>
Docs: bring both tools' documentation up to date
- Persona Chat: status and build history through the October 21 fixes and
  the fact sheet; conduct rules; API changes; the harness's compare mode;
  the designer guide and its Word copy rebuilt from it.
- Tutor: the README's conduct rules from the October 20 report, layout,
  migrations, live suites and deploy variables; the synthesis button by
  mode in the user guide; ALIGNMENT.md without drifting line numbers; the
  instructional designers' note corrected on readiness checks and live sync.
- Reclaim notes: the 10-21 persona-chat redeploy and the redeploy steps for
  both environments. Accessibility: the persona page's dialog, spinner and
  Retry, system notes and turn links.

Co-Authored-By: Claude Opus 5.5 <noreply@anthropic.com>
</commit_message>
<xml_diff>
--- a/docs/LTI-Tutor-for-Instructional-Designers.docx
+++ b/docs/LTI-Tutor-for-Instructional-Designers.docx
@@ -307,7 +307,7 @@
                 <w:sz w:val="20"/>
                 <w:szCs w:val="20"/>
               </w:rPr>
-              <w:t xml:space="preserve">Diagnostic before a unit. Misconceptions are noted, not corrected; the wrap-up says what to watch for.</w:t>
+              <w:t xml:space="preserve">Diagnostic before a unit. A false fact is corrected in one sentence, without teaching; the wrap-up says what to watch for.</w:t>
             </w:r>
           </w:p>
         </w:tc>
@@ -1726,7 +1726,7 @@
           <w:sz w:val="22"/>
           <w:szCs w:val="22"/>
         </w:rPr>
-        <w:t xml:space="preserve">It does not sync with the live course. The course comes in from a backup the author makes and uploads; re-importing updates the materials in place. Live sync needs Moodle web services, which are off on moodbox (section 7).</w:t>
+        <w:t xml:space="preserve">It syncs with the live course only where Moodle web services are on. On moodbox they are, and Sync from Moodle refreshes the materials in one click; on a site without them, the course comes in from a backup the author makes and uploads, and re-importing updates the materials in place.</w:t>
       </w:r>
     </w:p>
     <w:p>
@@ -1903,7 +1903,7 @@
                 <w:sz w:val="22"/>
                 <w:szCs w:val="22"/>
               </w:rPr>
-              <w:t xml:space="preserve"> The single most useful next step is a live connection to the course through Moodle web services, so materials refresh with one click and new assignments appear without a backup. It needs a site administrator to enable web services and create one read-only external service (course contents, pages, books, labels, resources, URLs, assignments, forum prompts, lessons, glossaries, and file download), and to issue a token. Nothing that touches users, grades or submissions, and nothing that writes. Most institutional Moodles already have web services on for the mobile app. The instructor guide lists the exact functions to request.</w:t>
+              <w:t xml:space="preserve"> Live sync through Moodle web services now works on moodbox, so materials refresh with one click and new assignments appear without a backup. TRU’s production Moodle would need the same: a site administrator enables web services, creates one read-only external service (course contents, pages, books, labels, resources, URLs, assignments, forum prompts, lessons, glossaries, and file download), and issues a token per instructor; one service and token serve both LTI Tutor and Persona Chat. Nothing that touches users, grades or submissions, and nothing that writes. Most institutional Moodles already have web services on for the mobile app. The instructor guide lists the exact functions to request.</w:t>
             </w:r>
           </w:p>
         </w:tc>
@@ -2038,7 +2038,7 @@
           <w:sz w:val="18"/>
           <w:szCs w:val="18"/>
         </w:rPr>
-        <w:t xml:space="preserve">Companion to the instructor guide. Full documentation: README.md and docs/ in the repository (delivery modes in docs/ALIGNMENT.md, accessibility in docs/ACCESSIBILITY.md, the instructor guide in docs/USER-GUIDE.md).</w:t>
+        <w:t xml:space="preserve">Companion to the instructor guide. Full documentation: README.md and docs/ in the repository (delivery modes in docs/ALIGNMENT.md, accessibility in docs/ACCESSIBILITY.md, the instructor guide in docs/USER-GUIDE.md). Its companion tool, Persona Chat, for conversations with a persona you design, has its own guide in docs/PERSONA-CHAT-USER-GUIDE.md.</w:t>
       </w:r>
     </w:p>
     <w:sectPr>

</xml_diff>